<commit_message>
Draft teen intensive legal reframe
</commit_message>
<xml_diff>
--- a/docs/teen-psychology-camp-2026/teen-psychology-camp-call-brief-2026.docx
+++ b/docs/teen-psychology-camp-2026/teen-psychology-camp-call-brief-2026.docx
@@ -13,7 +13,7 @@
           <w:color w:val="16215C"/>
           <w:sz w:val="40"/>
         </w:rPr>
-        <w:t>Памятка для созвона: подростковый лагерь «Психология без скуки»</w:t>
+        <w:t>Памятка для созвона: подростковый интенсив «Психология без скуки»</w:t>
       </w:r>
     </w:p>
     <w:p>
@@ -24,7 +24,7 @@
         <w:t xml:space="preserve">Коротко: </w:t>
       </w:r>
       <w:r>
-        <w:t>городской лагерь Татьяны Мунн для подростков: уверенность, общение, эмоции, ИИ для идей и первые шаги молодого психолога. 6-10 июля, Цветной бульвар, 10:00-18:00, группа 10-12 человек, одноразовое питание.</w:t>
+        <w:t>психологический интенсив Татьяны Мунн для подростков: уверенность, общение, эмоции, ИИ для идей и первые шаги молодого психолога. 6-10 июля, Цветной бульвар, 10:00-14:00, группа 10-12 человек. Формат подается как психологические и развивающие занятия без централизованного питания.</w:t>
       </w:r>
     </w:p>
     <w:p>
@@ -32,7 +32,7 @@
         <w:rPr>
           <w:b/>
         </w:rPr>
-        <w:t xml:space="preserve">Главная страница лагеря: </w:t>
+        <w:t xml:space="preserve">Главная страница интенсива: </w:t>
       </w:r>
       <w:hyperlink r:id="rId9">
         <w:r>
@@ -132,7 +132,7 @@
         <w:pStyle w:val="ListBullet"/>
       </w:pPr>
       <w:r>
-        <w:t>Это не школьный кружок и не терапевтическая группа, а камерный городской лагерь по психологии.</w:t>
+        <w:t>Это камерный психологический интенсив: серия развивающих занятий с ведущим специалистом.</w:t>
       </w:r>
     </w:p>
     <w:p>
@@ -180,7 +180,7 @@
         <w:pStyle w:val="ListBullet"/>
       </w:pPr>
       <w:r>
-        <w:t>оплата открывается по ссылке выше на странице лагеря;</w:t>
+        <w:t>оплата открывается по ссылке выше на странице интенсива;</w:t>
       </w:r>
     </w:p>
     <w:p>
@@ -253,7 +253,7 @@
                 <w:b/>
                 <w:sz w:val="19"/>
               </w:rPr>
-              <w:t>10:00-11:30</w:t>
+              <w:t>10:00-10:20</w:t>
             </w:r>
           </w:p>
         </w:tc>
@@ -268,7 +268,7 @@
                 <w:b w:val="0"/>
                 <w:sz w:val="19"/>
               </w:rPr>
-              <w:t>утренний блок и тема дня</w:t>
+              <w:t>сбор, настрой на день и правила безопасного общения</w:t>
             </w:r>
           </w:p>
         </w:tc>
@@ -285,7 +285,7 @@
                 <w:b/>
                 <w:sz w:val="19"/>
               </w:rPr>
-              <w:t>11:45-13:00</w:t>
+              <w:t>10:20-11:20</w:t>
             </w:r>
           </w:p>
         </w:tc>
@@ -300,7 +300,7 @@
                 <w:b w:val="0"/>
                 <w:sz w:val="19"/>
               </w:rPr>
-              <w:t>практика общения, эмоций или уверенности</w:t>
+              <w:t>тема дня, упражнения и личная карта наблюдений</w:t>
             </w:r>
           </w:p>
         </w:tc>
@@ -317,7 +317,7 @@
                 <w:b/>
                 <w:sz w:val="19"/>
               </w:rPr>
-              <w:t>13:00-14:00</w:t>
+              <w:t>11:20-11:35</w:t>
             </w:r>
           </w:p>
         </w:tc>
@@ -332,7 +332,7 @@
                 <w:b w:val="0"/>
                 <w:sz w:val="19"/>
               </w:rPr>
-              <w:t>обед, одноразовое питание, восстановление</w:t>
+              <w:t>пауза, вода, восстановление внимания</w:t>
             </w:r>
           </w:p>
         </w:tc>
@@ -349,7 +349,7 @@
                 <w:b/>
                 <w:sz w:val="19"/>
               </w:rPr>
-              <w:t>14:00-16:00</w:t>
+              <w:t>11:35-12:45</w:t>
             </w:r>
           </w:p>
         </w:tc>
@@ -364,7 +364,7 @@
                 <w:b w:val="0"/>
                 <w:sz w:val="19"/>
               </w:rPr>
-              <w:t>проектный блок: ИИ, профессия, личная эффективность</w:t>
+              <w:t>практика общения, эмоций, уверенности, ИИ или профессии</w:t>
             </w:r>
           </w:p>
         </w:tc>
@@ -381,7 +381,7 @@
                 <w:b/>
                 <w:sz w:val="19"/>
               </w:rPr>
-              <w:t>16:15-18:00</w:t>
+              <w:t>12:45-14:00</w:t>
             </w:r>
           </w:p>
         </w:tc>
@@ -407,7 +407,7 @@
         <w:pStyle w:val="Heading1"/>
       </w:pPr>
       <w:r>
-        <w:t>Календарь смен</w:t>
+        <w:t>Календарь потоков</w:t>
       </w:r>
     </w:p>
     <w:p>
@@ -415,7 +415,7 @@
         <w:pStyle w:val="ListBullet"/>
       </w:pPr>
       <w:r>
-        <w:t>6-10 июля — базовая смена «Психология без скуки».</w:t>
+        <w:t>6-10 июля — базовый поток «Психология без скуки».</w:t>
       </w:r>
     </w:p>
     <w:p>
@@ -506,7 +506,7 @@
             <w:color w:val="3149C9"/>
             <w:u w:val="single"/>
           </w:rPr>
-          <w:t>Оплатить участие в лагере</w:t>
+          <w:t>Оплатить участие в интенсиве</w:t>
         </w:r>
       </w:hyperlink>
     </w:p>
@@ -526,7 +526,7 @@
         <w:t xml:space="preserve">Нужно ли родителям присутствовать? </w:t>
       </w:r>
       <w:r>
-        <w:t>Нет, родители не присутствуют на занятиях.</w:t>
+        <w:t>Занятия проходят в группе с ведущим специалистом; организационные условия подтверждаются при записи.</w:t>
       </w:r>
     </w:p>
     <w:p>
@@ -537,7 +537,7 @@
         <w:t xml:space="preserve">Есть ли питание? </w:t>
       </w:r>
       <w:r>
-        <w:t>Да, предусмотрено одноразовое питание и перерывы.</w:t>
+        <w:t>Централизованное питание не заявляется. В расписании есть короткая пауза; индивидуальные вопросы лучше уточнить до старта.</w:t>
       </w:r>
     </w:p>
     <w:p>

</xml_diff>

<commit_message>
Restore teen intensive 10-18 format
</commit_message>
<xml_diff>
--- a/docs/teen-psychology-camp-2026/teen-psychology-camp-call-brief-2026.docx
+++ b/docs/teen-psychology-camp-2026/teen-psychology-camp-call-brief-2026.docx
@@ -24,7 +24,7 @@
         <w:t xml:space="preserve">Коротко: </w:t>
       </w:r>
       <w:r>
-        <w:t>психологический интенсив Татьяны Мунн для подростков: уверенность, общение, эмоции, ИИ для идей и первые шаги молодого психолога. 6-10 июля, Цветной бульвар, 10:00-14:00, группа 10-12 человек. Формат подается как психологические и развивающие занятия без централизованного питания.</w:t>
+        <w:t>психологический интенсив Татьяны Мунн для подростков: уверенность, общение, эмоции, ИИ для идей и первые шаги молодого психолога. 6-10 июля, Цветной бульвар, 10:00-18:00, группа 10-12 человек. Формат подается как психологические и развивающие занятия с паузами и обеденным перерывом.</w:t>
       </w:r>
     </w:p>
     <w:p>
@@ -253,7 +253,7 @@
                 <w:b/>
                 <w:sz w:val="19"/>
               </w:rPr>
-              <w:t>10:00-10:20</w:t>
+              <w:t>10:00-11:30</w:t>
             </w:r>
           </w:p>
         </w:tc>
@@ -268,7 +268,7 @@
                 <w:b w:val="0"/>
                 <w:sz w:val="19"/>
               </w:rPr>
-              <w:t>сбор, настрой на день и правила безопасного общения</w:t>
+              <w:t>утренний блок и тема дня</w:t>
             </w:r>
           </w:p>
         </w:tc>
@@ -285,7 +285,7 @@
                 <w:b/>
                 <w:sz w:val="19"/>
               </w:rPr>
-              <w:t>10:20-11:20</w:t>
+              <w:t>11:45-13:00</w:t>
             </w:r>
           </w:p>
         </w:tc>
@@ -300,7 +300,7 @@
                 <w:b w:val="0"/>
                 <w:sz w:val="19"/>
               </w:rPr>
-              <w:t>тема дня, упражнения и личная карта наблюдений</w:t>
+              <w:t>практика общения, эмоций или уверенности</w:t>
             </w:r>
           </w:p>
         </w:tc>
@@ -317,7 +317,7 @@
                 <w:b/>
                 <w:sz w:val="19"/>
               </w:rPr>
-              <w:t>11:20-11:35</w:t>
+              <w:t>13:00-14:00</w:t>
             </w:r>
           </w:p>
         </w:tc>
@@ -332,7 +332,7 @@
                 <w:b w:val="0"/>
                 <w:sz w:val="19"/>
               </w:rPr>
-              <w:t>пауза, вода, восстановление внимания</w:t>
+              <w:t>обеденный перерыв и восстановление</w:t>
             </w:r>
           </w:p>
         </w:tc>
@@ -349,7 +349,7 @@
                 <w:b/>
                 <w:sz w:val="19"/>
               </w:rPr>
-              <w:t>11:35-12:45</w:t>
+              <w:t>14:00-16:00</w:t>
             </w:r>
           </w:p>
         </w:tc>
@@ -364,7 +364,7 @@
                 <w:b w:val="0"/>
                 <w:sz w:val="19"/>
               </w:rPr>
-              <w:t>практика общения, эмоций, уверенности, ИИ или профессии</w:t>
+              <w:t>проектный блок: ИИ, профессия, личная эффективность</w:t>
             </w:r>
           </w:p>
         </w:tc>
@@ -381,7 +381,7 @@
                 <w:b/>
                 <w:sz w:val="19"/>
               </w:rPr>
-              <w:t>12:45-14:00</w:t>
+              <w:t>16:15-18:00</w:t>
             </w:r>
           </w:p>
         </w:tc>
@@ -537,7 +537,7 @@
         <w:t xml:space="preserve">Есть ли питание? </w:t>
       </w:r>
       <w:r>
-        <w:t>Централизованное питание не заявляется. В расписании есть короткая пауза; индивидуальные вопросы лучше уточнить до старта.</w:t>
+        <w:t>В расписании есть обеденный перерыв. Детали питания и индивидуальные вопросы лучше уточнить до старта.</w:t>
       </w:r>
     </w:p>
     <w:p>

</xml_diff>

<commit_message>
Update teen intensive custdev offer
</commit_message>
<xml_diff>
--- a/docs/teen-psychology-camp-2026/teen-psychology-camp-call-brief-2026.docx
+++ b/docs/teen-psychology-camp-2026/teen-psychology-camp-call-brief-2026.docx
@@ -24,7 +24,7 @@
         <w:t xml:space="preserve">Коротко: </w:t>
       </w:r>
       <w:r>
-        <w:t>психологический интенсив Татьяны Мунн для подростков: уверенность, общение, эмоции, ИИ для идей и первые шаги молодого психолога. 6-10 июля, Цветной бульвар, 10:00-18:00, группа 10-12 человек. Формат подается как психологические и развивающие занятия с паузами и обеденным перерывом.</w:t>
+        <w:t>психологический интенсив Татьяны Мунн для подростков: уверенность, общение, ораторская практика, эмоции, ИИ для идей, разгрузка после экзаменов и первые шаги молодого психолога. 6-10 июля, Цветной бульвар, 10:00-18:00, группа 10-12 человек. Формат подается как психологические и развивающие занятия с паузами и обеденным перерывом.</w:t>
       </w:r>
     </w:p>
     <w:p>
@@ -108,6 +108,22 @@
         <w:pStyle w:val="ListBullet"/>
       </w:pPr>
       <w:r>
+        <w:t>после ЕГЭ/ОГЭ хочется выдохнуть и мягко переключиться;</w:t>
+      </w:r>
+    </w:p>
+    <w:p>
+      <w:pPr>
+        <w:pStyle w:val="ListBullet"/>
+      </w:pPr>
+      <w:r>
+        <w:t>важно легче знакомиться, говорить с разными людьми и выступать без зажима;</w:t>
+      </w:r>
+    </w:p>
+    <w:p>
+      <w:pPr>
+        <w:pStyle w:val="ListBullet"/>
+      </w:pPr>
+      <w:r>
         <w:t>родители хотят практичный формат без тяжелой лекционности;</w:t>
       </w:r>
     </w:p>
@@ -140,7 +156,7 @@
         <w:pStyle w:val="ListBullet"/>
       </w:pPr>
       <w:r>
-        <w:t>Фокус: уверенность, общение, эмоции, ИИ для идей, личный план и знакомство с профессией психолога.</w:t>
+        <w:t>Фокус: уверенность, общение, речь, эмоции, ИИ для идей, личный план и знакомство с профессией психолога.</w:t>
       </w:r>
     </w:p>
     <w:p>
@@ -149,6 +165,14 @@
       </w:pPr>
       <w:r>
         <w:t>Татьяна Мунн ведет программу лично, группа 10-12 подростков.</w:t>
+      </w:r>
+    </w:p>
+    <w:p>
+      <w:pPr>
+        <w:pStyle w:val="ListBullet"/>
+      </w:pPr>
+      <w:r>
+        <w:t>Стандартная стоимость 50 000 ₽ объясняется расширенным форматом: личное ведение, камерная группа, материалы и возможные экспертные блоки.</w:t>
       </w:r>
     </w:p>
     <w:p>
@@ -365,6 +389,38 @@
                 <w:sz w:val="19"/>
               </w:rPr>
               <w:t>проектный блок: ИИ, профессия, личная эффективность</w:t>
+            </w:r>
+          </w:p>
+        </w:tc>
+      </w:tr>
+      <w:tr>
+        <w:tc>
+          <w:tcPr>
+            <w:tcW w:type="dxa" w:w="4968"/>
+          </w:tcPr>
+          <w:p>
+            <w:r>
+              <w:rPr>
+                <w:rFonts w:ascii="Arial" w:hAnsi="Arial"/>
+                <w:b/>
+                <w:sz w:val="19"/>
+              </w:rPr>
+              <w:t>внутри дня</w:t>
+            </w:r>
+          </w:p>
+        </w:tc>
+        <w:tc>
+          <w:tcPr>
+            <w:tcW w:type="dxa" w:w="4968"/>
+          </w:tcPr>
+          <w:p>
+            <w:r>
+              <w:rPr>
+                <w:rFonts w:ascii="Arial" w:hAnsi="Arial"/>
+                <w:b w:val="0"/>
+                <w:sz w:val="19"/>
+              </w:rPr>
+              <w:t>короткие речевые практики: знакомство, самопрезентация, мини-выступление</w:t>
             </w:r>
           </w:p>
         </w:tc>

</xml_diff>